<commit_message>
Doku auf Hardware-Kategorie, Tutorials und erweitertes Verzeichnis aktualisieren
PROJEKTPLAN.md, ARCHITECTURE.md, DESIGN.md, README.md und der Master-
Projektplan (Docs/AIActEU.docx) spiegeln jetzt den tatsächlichen Stand:
8. Kategorie "Hardware & Silicon", MDX-Tutorial-Layer unter /tutorials
(inkl. Architekturentscheidung dazu), aktualisierte Anbieter-/Quellen-
Zahlen (112 Anbieter/11 Domänen, 56 Quellen) sowie Moonshot AI und
Aleph Alpha im LLM-Labs-Bereich. Die "Nächste konkrete Schritte" im
Master-Projektplan sind als erledigt markiert; die dedizierte Surface-
RTX-Spark-Analyse-Seite bleibt bewusst als offener Punkt vermerkt.

Reine Dokumentationsänderung, kein Code betroffen.

Co-Authored-By: Claude Sonnet 5 <noreply@anthropic.com>
</commit_message>
<xml_diff>
--- a/Docs/📋 AIActEU.docx
+++ b/Docs/📋 AIActEU.docx
@@ -3121,7 +3121,7 @@
         <w:proofErr w:type="spellEnd"/>
       </w:hyperlink>
       <w:r>
-        <w:t xml:space="preserve"> (100 Anbieter, 10 je Domäne) und </w:t>
+        <w:t xml:space="preserve"> (112 Anbieter über 11 Domänen, inkl. Hardware &amp; Silicon; LLM-Labs u.a. um Moonshot AI und Aleph Alpha ergänzt) und </w:t>
       </w:r>
       <w:hyperlink r:id="rId45" w:tgtFrame="_blank" w:history="1">
         <w:proofErr w:type="spellStart"/>
@@ -4542,7 +4542,7 @@
       </w:pPr>
       <w:proofErr w:type="gramStart"/>
       <w:r>
-        <w:t>[ ]</w:t>
+        <w:t>[x]</w:t>
       </w:r>
       <w:proofErr w:type="gramEnd"/>
       <w:r>
@@ -4564,7 +4564,7 @@
         </w:numPr>
       </w:pPr>
       <w:r>
-        <w:t xml:space="preserve">Anbindung der neuen Hardware-Kategorien (NVIDIA Blackwell, AMD </w:t>
+        <w:t xml:space="preserve">✓ Anbindung der neuen Hardware-Kategorien (NVIDIA Blackwell, AMD </w:t>
       </w:r>
       <w:proofErr w:type="spellStart"/>
       <w:r>
@@ -4582,7 +4582,7 @@
       <w:proofErr w:type="spellEnd"/>
       <w:proofErr w:type="gramEnd"/>
       <w:r>
-        <w:t>.</w:t>
+        <w:t xml:space="preserve"> — umgesetzt (siehe data/sources.json).</w:t>
       </w:r>
     </w:p>
     <w:p>
@@ -4593,7 +4593,7 @@
         </w:numPr>
       </w:pPr>
       <w:r>
-        <w:t>Erstellung des MDX-Tutorial-Layers für Lokale KI (</w:t>
+        <w:t>✓ Erstellung des MDX-Tutorial-Layers für Lokale KI (</w:t>
       </w:r>
       <w:proofErr w:type="spellStart"/>
       <w:r>
@@ -4617,7 +4617,7 @@
       </w:r>
       <w:proofErr w:type="gramEnd"/>
       <w:r>
-        <w:t>).</w:t>
+        <w:t>) — umgesetzt (siehe /tutorials).</w:t>
       </w:r>
     </w:p>
     <w:p>
@@ -4628,7 +4628,7 @@
         </w:numPr>
       </w:pPr>
       <w:r>
-        <w:t xml:space="preserve">Integration der </w:t>
+        <w:t xml:space="preserve">✓ Integration der </w:t>
       </w:r>
       <w:r>
         <w:rPr>
@@ -4654,7 +4654,7 @@
         <w:t xml:space="preserve"> &amp; Dev Kits</w:t>
       </w:r>
       <w:r>
-        <w:t xml:space="preserve"> Sparte (z. B. Surface RTX Spark Dev Box Analysen).</w:t>
+        <w:t xml:space="preserve"> Sparte (z. B. Surface RTX Spark Dev Box Analysen). — Anbieter-Eintrag umgesetzt (siehe /verzeichnis), dedizierte Analyse-Seite noch offen.</w:t>
       </w:r>
     </w:p>
     <w:p>
@@ -4958,7 +4958,7 @@
           <w:b/>
           <w:bCs/>
         </w:rPr>
-        <w:t xml:space="preserve"> Zusammenfassung der nächsten Schritte</w:t>
+        <w:t xml:space="preserve"> Zusammenfassung der zuletzt umgesetzten Schritte (Stand 03.08.2026)</w:t>
       </w:r>
     </w:p>
     <w:p>
@@ -4969,7 +4969,7 @@
         </w:numPr>
       </w:pPr>
       <w:r>
-        <w:t xml:space="preserve">Erweitere </w:t>
+        <w:t xml:space="preserve">✓ Erweitere </w:t>
       </w:r>
       <w:proofErr w:type="spellStart"/>
       <w:r>
@@ -5004,7 +5004,7 @@
         </w:numPr>
       </w:pPr>
       <w:r>
-        <w:t>Erstelle unter frontend/</w:t>
+        <w:t>✓ Erstelle unter frontend/</w:t>
       </w:r>
       <w:proofErr w:type="spellStart"/>
       <w:r>
@@ -5039,7 +5039,7 @@
         </w:numPr>
       </w:pPr>
       <w:r>
-        <w:t xml:space="preserve">Integriere die </w:t>
+        <w:t xml:space="preserve">✓ Integriere die </w:t>
       </w:r>
       <w:r>
         <w:rPr>
@@ -5049,7 +5049,7 @@
         <w:t>Surface RTX Spark Dev Box</w:t>
       </w:r>
       <w:r>
-        <w:t xml:space="preserve"> und verwandte Hardware-Analysen als fester Bestandteil des /verzeichnis- und Hardware-Hubs.</w:t>
+        <w:t xml:space="preserve"> und verwandte Hardware-Analysen als fester Bestandteil des /verzeichnis- und Hardware-Hubs (Anbieter-Eintrag; dedizierte Analyse-Seite noch offen).</w:t>
       </w:r>
     </w:p>
     <w:p/>

</xml_diff>